<commit_message>
fix(frontend): apply FE-00 review round 3 (refresh timeout, ASCII only docs)
</commit_message>
<xml_diff>
--- a/docs/audit/FE-00_AI_Audit_Log.docx
+++ b/docs/audit/FE-00_AI_Audit_Log.docx
@@ -566,7 +566,7 @@
                 <w:sz w:val="18"/>
                 <w:szCs w:val="18"/>
               </w:rPr>
-              <w:t xml:space="preserve">2026-10-12 (round 1 and review round 2)</w:t>
+              <w:t xml:space="preserve">2026-10-12 (round 1, review rounds 2 and 3)</w:t>
             </w:r>
           </w:p>
         </w:tc>
@@ -631,7 +631,7 @@
                 <w:sz w:val="18"/>
                 <w:szCs w:val="18"/>
               </w:rPr>
-              <w:t xml:space="preserve">Implemented, review round 2 applied; 65 automated tests and 20 browser checks pass; manual run against the real backend pending</w:t>
+              <w:t xml:space="preserve">Implemented, review rounds 2 and 3 applied; 68 automated tests and 25 browser checks pass; manual run against the real backend pending</w:t>
             </w:r>
           </w:p>
         </w:tc>
@@ -688,7 +688,7 @@
           <w:sz w:val="21"/>
           <w:szCs w:val="21"/>
         </w:rPr>
-        <w:t xml:space="preserve">After review round 2, all 65 Vitest tests, npm run lint and npm run build pass. The flows were also checked in Chromium against a local mock that copies the backend auth contract. The real Spring Boot backend could not be started in the AI workspace (the SQL Server image registry is blocked there), so the manual cases in docs/tests/FE-00_test_cases.md section 3 must be run on a team machine before merging.</w:t>
+        <w:t xml:space="preserve">After review round 3, all 68 Vitest tests, npm run lint and npm run build pass. The flows were also checked in Chromium against a local mock that copies the backend auth contract. The real Spring Boot backend could not be started in the AI workspace (the SQL Server image registry is blocked there), so the manual cases in docs/tests/FE-00_test_cases.md section 3 must be run on a team machine before merging.</w:t>
       </w:r>
     </w:p>
     <w:p>
@@ -3836,7 +3836,7 @@
                 <w:sz w:val="18"/>
                 <w:szCs w:val="18"/>
               </w:rPr>
-              <w:t xml:space="preserve">engines.node ^22.13.0 || ^24.0.0 || &gt;=26.0.0, .nvmrc 24, README notes on Node and strictPort 5173.</w:t>
+              <w:t xml:space="preserve">engines.node accepts Node 22.13 or newer in the 22 line, Node 24, and Node 26 or newer. The file .nvmrc names Node 24. The README explains the Node requirement and the fixed port 5173 (strictPort).</w:t>
             </w:r>
           </w:p>
         </w:tc>
@@ -7501,7 +7501,1499 @@
           <w:sz w:val="28"/>
           <w:szCs w:val="28"/>
         </w:rPr>
-        <w:t xml:space="preserve">8. Repository File Inventory (whole task, compared with main)</w:t>
+        <w:t xml:space="preserve">8. Review Round 3</w:t>
+      </w:r>
+    </w:p>
+    <w:p>
+      <w:pPr>
+        <w:spacing w:after="120" w:before="0"/>
+      </w:pPr>
+      <w:r>
+        <w:rPr>
+          <w:rFonts w:ascii="Calibri" w:cs="Calibri" w:eastAsia="Calibri" w:hAnsi="Calibri"/>
+          <w:sz w:val="21"/>
+          <w:szCs w:val="21"/>
+        </w:rPr>
+        <w:t xml:space="preserve">A third review found two remaining defects. The scope stayed inside frontend/ and docs; no backend file was changed. The AI assistant made the changes; the developer reviews the diff and runs the manual cases.</w:t>
+      </w:r>
+    </w:p>
+    <w:p>
+      <w:pPr>
+        <w:pStyle w:val="Heading2"/>
+        <w:spacing w:after="100" w:before="200"/>
+      </w:pPr>
+      <w:r>
+        <w:rPr>
+          <w:rFonts w:ascii="Calibri" w:cs="Calibri" w:eastAsia="Calibri" w:hAnsi="Calibri"/>
+          <w:b/>
+          <w:bCs/>
+          <w:color w:val="2169BA"/>
+          <w:sz w:val="24"/>
+          <w:szCs w:val="24"/>
+        </w:rPr>
+        <w:t xml:space="preserve">8.1 Findings and changes</w:t>
+      </w:r>
+    </w:p>
+    <w:tbl>
+      <w:tblPr>
+        <w:tblW w:type="dxa" w:w="9360"/>
+        <w:tblBorders>
+          <w:top w:val="single" w:color="auto" w:sz="4"/>
+          <w:left w:val="single" w:color="auto" w:sz="4"/>
+          <w:bottom w:val="single" w:color="auto" w:sz="4"/>
+          <w:right w:val="single" w:color="auto" w:sz="4"/>
+          <w:insideH w:val="single" w:color="auto" w:sz="4"/>
+          <w:insideV w:val="single" w:color="auto" w:sz="4"/>
+        </w:tblBorders>
+      </w:tblPr>
+      <w:tblGrid>
+        <w:gridCol w:w="2500"/>
+        <w:gridCol w:w="4360"/>
+        <w:gridCol w:w="2500"/>
+      </w:tblGrid>
+      <w:tr>
+        <w:trPr>
+          <w:cantSplit/>
+          <w:tblHeader/>
+        </w:trPr>
+        <w:tc>
+          <w:tcPr>
+            <w:tcW w:type="dxa" w:w="2500"/>
+            <w:tcBorders>
+              <w:top w:val="single" w:color="C5D3E1" w:sz="4"/>
+              <w:left w:val="single" w:color="C5D3E1" w:sz="4"/>
+              <w:bottom w:val="single" w:color="C5D3E1" w:sz="4"/>
+              <w:right w:val="single" w:color="C5D3E1" w:sz="4"/>
+            </w:tcBorders>
+            <w:shd w:fill="EAF3FD" w:color="auto" w:val="clear"/>
+            <w:tcMar>
+              <w:top w:type="dxa" w:w="60"/>
+              <w:left w:type="dxa" w:w="100"/>
+              <w:bottom w:type="dxa" w:w="60"/>
+              <w:right w:type="dxa" w:w="100"/>
+            </w:tcMar>
+          </w:tcPr>
+          <w:p>
+            <w:r>
+              <w:rPr>
+                <w:rFonts w:ascii="Calibri" w:cs="Calibri" w:eastAsia="Calibri" w:hAnsi="Calibri"/>
+                <w:b/>
+                <w:bCs/>
+                <w:sz w:val="18"/>
+                <w:szCs w:val="18"/>
+              </w:rPr>
+              <w:t xml:space="preserve">Finding</w:t>
+            </w:r>
+          </w:p>
+        </w:tc>
+        <w:tc>
+          <w:tcPr>
+            <w:tcW w:type="dxa" w:w="4360"/>
+            <w:tcBorders>
+              <w:top w:val="single" w:color="C5D3E1" w:sz="4"/>
+              <w:left w:val="single" w:color="C5D3E1" w:sz="4"/>
+              <w:bottom w:val="single" w:color="C5D3E1" w:sz="4"/>
+              <w:right w:val="single" w:color="C5D3E1" w:sz="4"/>
+            </w:tcBorders>
+            <w:shd w:fill="EAF3FD" w:color="auto" w:val="clear"/>
+            <w:tcMar>
+              <w:top w:type="dxa" w:w="60"/>
+              <w:left w:type="dxa" w:w="100"/>
+              <w:bottom w:type="dxa" w:w="60"/>
+              <w:right w:type="dxa" w:w="100"/>
+            </w:tcMar>
+          </w:tcPr>
+          <w:p>
+            <w:r>
+              <w:rPr>
+                <w:rFonts w:ascii="Calibri" w:cs="Calibri" w:eastAsia="Calibri" w:hAnsi="Calibri"/>
+                <w:b/>
+                <w:bCs/>
+                <w:sz w:val="18"/>
+                <w:szCs w:val="18"/>
+              </w:rPr>
+              <w:t xml:space="preserve">Change</w:t>
+            </w:r>
+          </w:p>
+        </w:tc>
+        <w:tc>
+          <w:tcPr>
+            <w:tcW w:type="dxa" w:w="2500"/>
+            <w:tcBorders>
+              <w:top w:val="single" w:color="C5D3E1" w:sz="4"/>
+              <w:left w:val="single" w:color="C5D3E1" w:sz="4"/>
+              <w:bottom w:val="single" w:color="C5D3E1" w:sz="4"/>
+              <w:right w:val="single" w:color="C5D3E1" w:sz="4"/>
+            </w:tcBorders>
+            <w:shd w:fill="EAF3FD" w:color="auto" w:val="clear"/>
+            <w:tcMar>
+              <w:top w:type="dxa" w:w="60"/>
+              <w:left w:type="dxa" w:w="100"/>
+              <w:bottom w:type="dxa" w:w="60"/>
+              <w:right w:type="dxa" w:w="100"/>
+            </w:tcMar>
+          </w:tcPr>
+          <w:p>
+            <w:r>
+              <w:rPr>
+                <w:rFonts w:ascii="Calibri" w:cs="Calibri" w:eastAsia="Calibri" w:hAnsi="Calibri"/>
+                <w:b/>
+                <w:bCs/>
+                <w:sz w:val="18"/>
+                <w:szCs w:val="18"/>
+              </w:rPr>
+              <w:t xml:space="preserve">Files</w:t>
+            </w:r>
+          </w:p>
+        </w:tc>
+      </w:tr>
+      <w:tr>
+        <w:trPr>
+          <w:cantSplit/>
+          <w:tblHeader w:val="false"/>
+        </w:trPr>
+        <w:tc>
+          <w:tcPr>
+            <w:tcW w:type="dxa" w:w="2500"/>
+            <w:tcBorders>
+              <w:top w:val="single" w:color="C5D3E1" w:sz="4"/>
+              <w:left w:val="single" w:color="C5D3E1" w:sz="4"/>
+              <w:bottom w:val="single" w:color="C5D3E1" w:sz="4"/>
+              <w:right w:val="single" w:color="C5D3E1" w:sz="4"/>
+            </w:tcBorders>
+            <w:tcMar>
+              <w:top w:type="dxa" w:w="60"/>
+              <w:left w:type="dxa" w:w="100"/>
+              <w:bottom w:type="dxa" w:w="60"/>
+              <w:right w:type="dxa" w:w="100"/>
+            </w:tcMar>
+          </w:tcPr>
+          <w:p>
+            <w:r>
+              <w:rPr>
+                <w:rFonts w:ascii="Calibri" w:cs="Calibri" w:eastAsia="Calibri" w:hAnsi="Calibri"/>
+                <w:b w:val="false"/>
+                <w:bCs w:val="false"/>
+                <w:sz w:val="18"/>
+                <w:szCs w:val="18"/>
+              </w:rPr>
+              <w:t xml:space="preserve">Fix 1: POST /auth/refresh had no timeout although it runs while the tab holds the cross tab lock; a server that accepts the connection but never answers would block every other tab waiting for a refresh</w:t>
+            </w:r>
+          </w:p>
+        </w:tc>
+        <w:tc>
+          <w:tcPr>
+            <w:tcW w:type="dxa" w:w="4360"/>
+            <w:tcBorders>
+              <w:top w:val="single" w:color="C5D3E1" w:sz="4"/>
+              <w:left w:val="single" w:color="C5D3E1" w:sz="4"/>
+              <w:bottom w:val="single" w:color="C5D3E1" w:sz="4"/>
+              <w:right w:val="single" w:color="C5D3E1" w:sz="4"/>
+            </w:tcBorders>
+            <w:tcMar>
+              <w:top w:type="dxa" w:w="60"/>
+              <w:left w:type="dxa" w:w="100"/>
+              <w:bottom w:type="dxa" w:w="60"/>
+              <w:right w:type="dxa" w:w="100"/>
+            </w:tcMar>
+          </w:tcPr>
+          <w:p>
+            <w:r>
+              <w:rPr>
+                <w:rFonts w:ascii="Calibri" w:cs="Calibri" w:eastAsia="Calibri" w:hAnsi="Calibri"/>
+                <w:b w:val="false"/>
+                <w:bCs w:val="false"/>
+                <w:sz w:val="18"/>
+                <w:szCs w:val="18"/>
+              </w:rPr>
+              <w:t xml:space="preserve">Named constant REFRESH_TIMEOUT_MS (15000 ms). The refresh fetch gets an AbortController whose abort is scheduled with setTimeout; the timer covers the headers and the body and is always cleared in a finally block. A timeout is handled like a network error: ApiError with status 0 and the network message, tokens kept, no logout, and the error ends the lock callback so the lock is released. The send function, normal requests and caller supplied abort signals are unchanged.</w:t>
+            </w:r>
+          </w:p>
+        </w:tc>
+        <w:tc>
+          <w:tcPr>
+            <w:tcW w:type="dxa" w:w="2500"/>
+            <w:tcBorders>
+              <w:top w:val="single" w:color="C5D3E1" w:sz="4"/>
+              <w:left w:val="single" w:color="C5D3E1" w:sz="4"/>
+              <w:bottom w:val="single" w:color="C5D3E1" w:sz="4"/>
+              <w:right w:val="single" w:color="C5D3E1" w:sz="4"/>
+            </w:tcBorders>
+            <w:tcMar>
+              <w:top w:type="dxa" w:w="60"/>
+              <w:left w:type="dxa" w:w="100"/>
+              <w:bottom w:type="dxa" w:w="60"/>
+              <w:right w:type="dxa" w:w="100"/>
+            </w:tcMar>
+          </w:tcPr>
+          <w:p>
+            <w:r>
+              <w:rPr>
+                <w:rFonts w:ascii="Calibri" w:cs="Calibri" w:eastAsia="Calibri" w:hAnsi="Calibri"/>
+                <w:b w:val="false"/>
+                <w:bCs w:val="false"/>
+                <w:sz w:val="18"/>
+                <w:szCs w:val="18"/>
+              </w:rPr>
+              <w:t xml:space="preserve">frontend/src/api/client.ts, frontend/src/api/crossTab.test.ts</w:t>
+            </w:r>
+          </w:p>
+        </w:tc>
+      </w:tr>
+      <w:tr>
+        <w:trPr>
+          <w:cantSplit/>
+          <w:tblHeader w:val="false"/>
+        </w:trPr>
+        <w:tc>
+          <w:tcPr>
+            <w:tcW w:type="dxa" w:w="2500"/>
+            <w:tcBorders>
+              <w:top w:val="single" w:color="C5D3E1" w:sz="4"/>
+              <w:left w:val="single" w:color="C5D3E1" w:sz="4"/>
+              <w:bottom w:val="single" w:color="C5D3E1" w:sz="4"/>
+              <w:right w:val="single" w:color="C5D3E1" w:sz="4"/>
+            </w:tcBorders>
+            <w:tcMar>
+              <w:top w:type="dxa" w:w="60"/>
+              <w:left w:type="dxa" w:w="100"/>
+              <w:bottom w:type="dxa" w:w="60"/>
+              <w:right w:type="dxa" w:w="100"/>
+            </w:tcMar>
+          </w:tcPr>
+          <w:p>
+            <w:r>
+              <w:rPr>
+                <w:rFonts w:ascii="Calibri" w:cs="Calibri" w:eastAsia="Calibri" w:hAnsi="Calibri"/>
+                <w:b w:val="false"/>
+                <w:bCs w:val="false"/>
+                <w:sz w:val="18"/>
+                <w:szCs w:val="18"/>
+              </w:rPr>
+              <w:t xml:space="preserve">Fix 2: the audit log row about the Node version requirement used a vertical bar pair in prose</w:t>
+            </w:r>
+          </w:p>
+        </w:tc>
+        <w:tc>
+          <w:tcPr>
+            <w:tcW w:type="dxa" w:w="4360"/>
+            <w:tcBorders>
+              <w:top w:val="single" w:color="C5D3E1" w:sz="4"/>
+              <w:left w:val="single" w:color="C5D3E1" w:sz="4"/>
+              <w:bottom w:val="single" w:color="C5D3E1" w:sz="4"/>
+              <w:right w:val="single" w:color="C5D3E1" w:sz="4"/>
+            </w:tcBorders>
+            <w:tcMar>
+              <w:top w:type="dxa" w:w="60"/>
+              <w:left w:type="dxa" w:w="100"/>
+              <w:bottom w:type="dxa" w:w="60"/>
+              <w:right w:type="dxa" w:w="100"/>
+            </w:tcMar>
+          </w:tcPr>
+          <w:p>
+            <w:r>
+              <w:rPr>
+                <w:rFonts w:ascii="Calibri" w:cs="Calibri" w:eastAsia="Calibri" w:hAnsi="Calibri"/>
+                <w:b w:val="false"/>
+                <w:bCs w:val="false"/>
+                <w:sz w:val="18"/>
+                <w:szCs w:val="18"/>
+              </w:rPr>
+              <w:t xml:space="preserve">The row now says in words that engines.node accepts Node 22.13 or newer in the 22 line, Node 24, and Node 26 or newer. The real range stays only in frontend/package.json, which is code.</w:t>
+            </w:r>
+          </w:p>
+        </w:tc>
+        <w:tc>
+          <w:tcPr>
+            <w:tcW w:type="dxa" w:w="2500"/>
+            <w:tcBorders>
+              <w:top w:val="single" w:color="C5D3E1" w:sz="4"/>
+              <w:left w:val="single" w:color="C5D3E1" w:sz="4"/>
+              <w:bottom w:val="single" w:color="C5D3E1" w:sz="4"/>
+              <w:right w:val="single" w:color="C5D3E1" w:sz="4"/>
+            </w:tcBorders>
+            <w:tcMar>
+              <w:top w:type="dxa" w:w="60"/>
+              <w:left w:type="dxa" w:w="100"/>
+              <w:bottom w:type="dxa" w:w="60"/>
+              <w:right w:type="dxa" w:w="100"/>
+            </w:tcMar>
+          </w:tcPr>
+          <w:p>
+            <w:r>
+              <w:rPr>
+                <w:rFonts w:ascii="Calibri" w:cs="Calibri" w:eastAsia="Calibri" w:hAnsi="Calibri"/>
+                <w:b w:val="false"/>
+                <w:bCs w:val="false"/>
+                <w:sz w:val="18"/>
+                <w:szCs w:val="18"/>
+              </w:rPr>
+              <w:t xml:space="preserve">docs/audit/FE-00_AI_Audit_Log.docx</w:t>
+            </w:r>
+          </w:p>
+        </w:tc>
+      </w:tr>
+      <w:tr>
+        <w:trPr>
+          <w:cantSplit/>
+          <w:tblHeader w:val="false"/>
+        </w:trPr>
+        <w:tc>
+          <w:tcPr>
+            <w:tcW w:type="dxa" w:w="2500"/>
+            <w:tcBorders>
+              <w:top w:val="single" w:color="C5D3E1" w:sz="4"/>
+              <w:left w:val="single" w:color="C5D3E1" w:sz="4"/>
+              <w:bottom w:val="single" w:color="C5D3E1" w:sz="4"/>
+              <w:right w:val="single" w:color="C5D3E1" w:sz="4"/>
+            </w:tcBorders>
+            <w:tcMar>
+              <w:top w:type="dxa" w:w="60"/>
+              <w:left w:type="dxa" w:w="100"/>
+              <w:bottom w:type="dxa" w:w="60"/>
+              <w:right w:type="dxa" w:w="100"/>
+            </w:tcMar>
+          </w:tcPr>
+          <w:p>
+            <w:r>
+              <w:rPr>
+                <w:rFonts w:ascii="Calibri" w:cs="Calibri" w:eastAsia="Calibri" w:hAnsi="Calibri"/>
+                <w:b w:val="false"/>
+                <w:bCs w:val="false"/>
+                <w:sz w:val="18"/>
+                <w:szCs w:val="18"/>
+              </w:rPr>
+              <w:t xml:space="preserve">Fix 2, scan finding: the list definitions of the audit log used bullet glyphs above code point 127 (four kinds, 10 occurrences in word/numbering.xml)</w:t>
+            </w:r>
+          </w:p>
+        </w:tc>
+        <w:tc>
+          <w:tcPr>
+            <w:tcW w:type="dxa" w:w="4360"/>
+            <w:tcBorders>
+              <w:top w:val="single" w:color="C5D3E1" w:sz="4"/>
+              <w:left w:val="single" w:color="C5D3E1" w:sz="4"/>
+              <w:bottom w:val="single" w:color="C5D3E1" w:sz="4"/>
+              <w:right w:val="single" w:color="C5D3E1" w:sz="4"/>
+            </w:tcBorders>
+            <w:tcMar>
+              <w:top w:type="dxa" w:w="60"/>
+              <w:left w:type="dxa" w:w="100"/>
+              <w:bottom w:type="dxa" w:w="60"/>
+              <w:right w:type="dxa" w:w="100"/>
+            </w:tcMar>
+          </w:tcPr>
+          <w:p>
+            <w:r>
+              <w:rPr>
+                <w:rFonts w:ascii="Calibri" w:cs="Calibri" w:eastAsia="Calibri" w:hAnsi="Calibri"/>
+                <w:b w:val="false"/>
+                <w:bCs w:val="false"/>
+                <w:sz w:val="18"/>
+                <w:szCs w:val="18"/>
+              </w:rPr>
+              <w:t xml:space="preserve">All bullet levels now use a plain hyphen.</w:t>
+            </w:r>
+          </w:p>
+        </w:tc>
+        <w:tc>
+          <w:tcPr>
+            <w:tcW w:type="dxa" w:w="2500"/>
+            <w:tcBorders>
+              <w:top w:val="single" w:color="C5D3E1" w:sz="4"/>
+              <w:left w:val="single" w:color="C5D3E1" w:sz="4"/>
+              <w:bottom w:val="single" w:color="C5D3E1" w:sz="4"/>
+              <w:right w:val="single" w:color="C5D3E1" w:sz="4"/>
+            </w:tcBorders>
+            <w:tcMar>
+              <w:top w:type="dxa" w:w="60"/>
+              <w:left w:type="dxa" w:w="100"/>
+              <w:bottom w:type="dxa" w:w="60"/>
+              <w:right w:type="dxa" w:w="100"/>
+            </w:tcMar>
+          </w:tcPr>
+          <w:p>
+            <w:r>
+              <w:rPr>
+                <w:rFonts w:ascii="Calibri" w:cs="Calibri" w:eastAsia="Calibri" w:hAnsi="Calibri"/>
+                <w:b w:val="false"/>
+                <w:bCs w:val="false"/>
+                <w:sz w:val="18"/>
+                <w:szCs w:val="18"/>
+              </w:rPr>
+              <w:t xml:space="preserve">docs/audit/FE-00_AI_Audit_Log.docx</w:t>
+            </w:r>
+          </w:p>
+        </w:tc>
+      </w:tr>
+      <w:tr>
+        <w:trPr>
+          <w:cantSplit/>
+          <w:tblHeader w:val="false"/>
+        </w:trPr>
+        <w:tc>
+          <w:tcPr>
+            <w:tcW w:type="dxa" w:w="2500"/>
+            <w:tcBorders>
+              <w:top w:val="single" w:color="C5D3E1" w:sz="4"/>
+              <w:left w:val="single" w:color="C5D3E1" w:sz="4"/>
+              <w:bottom w:val="single" w:color="C5D3E1" w:sz="4"/>
+              <w:right w:val="single" w:color="C5D3E1" w:sz="4"/>
+            </w:tcBorders>
+            <w:tcMar>
+              <w:top w:type="dxa" w:w="60"/>
+              <w:left w:type="dxa" w:w="100"/>
+              <w:bottom w:type="dxa" w:w="60"/>
+              <w:right w:type="dxa" w:w="100"/>
+            </w:tcMar>
+          </w:tcPr>
+          <w:p>
+            <w:r>
+              <w:rPr>
+                <w:rFonts w:ascii="Calibri" w:cs="Calibri" w:eastAsia="Calibri" w:hAnsi="Calibri"/>
+                <w:b w:val="false"/>
+                <w:bCs w:val="false"/>
+                <w:sz w:val="18"/>
+                <w:szCs w:val="18"/>
+              </w:rPr>
+              <w:t xml:space="preserve">Fix 2, scan finding: the BE-09 entry of CHANGELOG.md used four arrows in prose</w:t>
+            </w:r>
+          </w:p>
+        </w:tc>
+        <w:tc>
+          <w:tcPr>
+            <w:tcW w:type="dxa" w:w="4360"/>
+            <w:tcBorders>
+              <w:top w:val="single" w:color="C5D3E1" w:sz="4"/>
+              <w:left w:val="single" w:color="C5D3E1" w:sz="4"/>
+              <w:bottom w:val="single" w:color="C5D3E1" w:sz="4"/>
+              <w:right w:val="single" w:color="C5D3E1" w:sz="4"/>
+            </w:tcBorders>
+            <w:tcMar>
+              <w:top w:type="dxa" w:w="60"/>
+              <w:left w:type="dxa" w:w="100"/>
+              <w:bottom w:type="dxa" w:w="60"/>
+              <w:right w:type="dxa" w:w="100"/>
+            </w:tcMar>
+          </w:tcPr>
+          <w:p>
+            <w:r>
+              <w:rPr>
+                <w:rFonts w:ascii="Calibri" w:cs="Calibri" w:eastAsia="Calibri" w:hAnsi="Calibri"/>
+                <w:b w:val="false"/>
+                <w:bCs w:val="false"/>
+                <w:sz w:val="18"/>
+                <w:szCs w:val="18"/>
+              </w:rPr>
+              <w:t xml:space="preserve">Each arrow replaced with the word gives; meaning unchanged. This is the only change outside the FE-00 text.</w:t>
+            </w:r>
+          </w:p>
+        </w:tc>
+        <w:tc>
+          <w:tcPr>
+            <w:tcW w:type="dxa" w:w="2500"/>
+            <w:tcBorders>
+              <w:top w:val="single" w:color="C5D3E1" w:sz="4"/>
+              <w:left w:val="single" w:color="C5D3E1" w:sz="4"/>
+              <w:bottom w:val="single" w:color="C5D3E1" w:sz="4"/>
+              <w:right w:val="single" w:color="C5D3E1" w:sz="4"/>
+            </w:tcBorders>
+            <w:tcMar>
+              <w:top w:type="dxa" w:w="60"/>
+              <w:left w:type="dxa" w:w="100"/>
+              <w:bottom w:type="dxa" w:w="60"/>
+              <w:right w:type="dxa" w:w="100"/>
+            </w:tcMar>
+          </w:tcPr>
+          <w:p>
+            <w:r>
+              <w:rPr>
+                <w:rFonts w:ascii="Calibri" w:cs="Calibri" w:eastAsia="Calibri" w:hAnsi="Calibri"/>
+                <w:b w:val="false"/>
+                <w:bCs w:val="false"/>
+                <w:sz w:val="18"/>
+                <w:szCs w:val="18"/>
+              </w:rPr>
+              <w:t xml:space="preserve">CHANGELOG.md</w:t>
+            </w:r>
+          </w:p>
+        </w:tc>
+      </w:tr>
+    </w:tbl>
+    <w:p>
+      <w:pPr>
+        <w:pStyle w:val="Heading2"/>
+        <w:spacing w:after="100" w:before="200"/>
+      </w:pPr>
+      <w:r>
+        <w:rPr>
+          <w:rFonts w:ascii="Calibri" w:cs="Calibri" w:eastAsia="Calibri" w:hAnsi="Calibri"/>
+          <w:b/>
+          <w:bCs/>
+          <w:color w:val="2169BA"/>
+          <w:sz w:val="24"/>
+          <w:szCs w:val="24"/>
+        </w:rPr>
+        <w:t xml:space="preserve">8.2 Character scan</w:t>
+      </w:r>
+    </w:p>
+    <w:p>
+      <w:pPr>
+        <w:spacing w:after="120" w:before="0"/>
+      </w:pPr>
+      <w:r>
+        <w:rPr>
+          <w:rFonts w:ascii="Calibri" w:cs="Calibri" w:eastAsia="Calibri" w:hAnsi="Calibri"/>
+          <w:sz w:val="21"/>
+          <w:szCs w:val="21"/>
+        </w:rPr>
+        <w:t xml:space="preserve">A Node script read every part of this docx (all XML files, including the list definitions), frontend/README.md, docs/tests/FE-00_test_cases.md, CHANGELOG.md, FE-00_CHANGES.md and all files under frontend/src. It reports every character above code point 127, and in the prose documents also a vertical bar pair or an arrow outside code spans and code blocks.</w:t>
+      </w:r>
+    </w:p>
+    <w:p>
+      <w:pPr>
+        <w:pStyle w:val="ListParagraph"/>
+        <w:numPr>
+          <w:ilvl w:val="0"/>
+          <w:numId w:val="2"/>
+        </w:numPr>
+        <w:spacing w:after="80"/>
+      </w:pPr>
+      <w:r>
+        <w:rPr>
+          <w:rFonts w:ascii="Calibri" w:cs="Calibri" w:eastAsia="Calibri" w:hAnsi="Calibri"/>
+          <w:b/>
+          <w:bCs/>
+          <w:sz w:val="21"/>
+          <w:szCs w:val="21"/>
+        </w:rPr>
+        <w:t xml:space="preserve">Before the fixes: </w:t>
+      </w:r>
+      <w:r>
+        <w:rPr>
+          <w:rFonts w:ascii="Calibri" w:cs="Calibri" w:eastAsia="Calibri" w:hAnsi="Calibri"/>
+          <w:sz w:val="21"/>
+          <w:szCs w:val="21"/>
+        </w:rPr>
+        <w:t xml:space="preserve">frontend/src (65 files), frontend/README.md and docs/tests/FE-00_test_cases.md had no hits. Hits: this docx (the Step 4b row, and 10 bullet glyphs in word/numbering.xml: U+25CF, U+25CB, U+25A0, U+2022), the round 2 FE-00_CHANGES.md (one vertical bar pair in prose, replaced by the round 3 file) and CHANGELOG.md line 96 (arrows in the BE-09 entry).</w:t>
+      </w:r>
+    </w:p>
+    <w:p>
+      <w:pPr>
+        <w:pStyle w:val="ListParagraph"/>
+        <w:numPr>
+          <w:ilvl w:val="0"/>
+          <w:numId w:val="2"/>
+        </w:numPr>
+        <w:spacing w:after="80"/>
+      </w:pPr>
+      <w:r>
+        <w:rPr>
+          <w:rFonts w:ascii="Calibri" w:cs="Calibri" w:eastAsia="Calibri" w:hAnsi="Calibri"/>
+          <w:b/>
+          <w:bCs/>
+          <w:sz w:val="21"/>
+          <w:szCs w:val="21"/>
+        </w:rPr>
+        <w:t xml:space="preserve">Note on the reported character: </w:t>
+      </w:r>
+      <w:r>
+        <w:rPr>
+          <w:rFonts w:ascii="Calibri" w:cs="Calibri" w:eastAsia="Calibri" w:hAnsi="Calibri"/>
+          <w:sz w:val="21"/>
+          <w:szCs w:val="21"/>
+        </w:rPr>
+        <w:t xml:space="preserve">The Step 4b row contained the ASCII vertical bar (U+007C) twice, not the box drawing character U+2502. A viewer can show it as a box drawing line. The row was rewritten in words either way.</w:t>
+      </w:r>
+    </w:p>
+    <w:p>
+      <w:pPr>
+        <w:pStyle w:val="ListParagraph"/>
+        <w:numPr>
+          <w:ilvl w:val="0"/>
+          <w:numId w:val="2"/>
+        </w:numPr>
+        <w:spacing w:after="80"/>
+      </w:pPr>
+      <w:r>
+        <w:rPr>
+          <w:rFonts w:ascii="Calibri" w:cs="Calibri" w:eastAsia="Calibri" w:hAnsi="Calibri"/>
+          <w:b/>
+          <w:bCs/>
+          <w:sz w:val="21"/>
+          <w:szCs w:val="21"/>
+        </w:rPr>
+        <w:t xml:space="preserve">After the fixes: </w:t>
+      </w:r>
+      <w:r>
+        <w:rPr>
+          <w:rFonts w:ascii="Calibri" w:cs="Calibri" w:eastAsia="Calibri" w:hAnsi="Calibri"/>
+          <w:sz w:val="21"/>
+          <w:szCs w:val="21"/>
+        </w:rPr>
+        <w:t xml:space="preserve">No hits in any scanned file. Vietnamese text: none.</w:t>
+      </w:r>
+    </w:p>
+    <w:p>
+      <w:pPr>
+        <w:pStyle w:val="Heading2"/>
+        <w:spacing w:after="100" w:before="200"/>
+      </w:pPr>
+      <w:r>
+        <w:rPr>
+          <w:rFonts w:ascii="Calibri" w:cs="Calibri" w:eastAsia="Calibri" w:hAnsi="Calibri"/>
+          <w:b/>
+          <w:bCs/>
+          <w:color w:val="2169BA"/>
+          <w:sz w:val="24"/>
+          <w:szCs w:val="24"/>
+        </w:rPr>
+        <w:t xml:space="preserve">8.3 Test results</w:t>
+      </w:r>
+    </w:p>
+    <w:p>
+      <w:pPr>
+        <w:pStyle w:val="ListParagraph"/>
+        <w:numPr>
+          <w:ilvl w:val="0"/>
+          <w:numId w:val="2"/>
+        </w:numPr>
+        <w:spacing w:after="80"/>
+      </w:pPr>
+      <w:r>
+        <w:rPr>
+          <w:rFonts w:ascii="Calibri" w:cs="Calibri" w:eastAsia="Calibri" w:hAnsi="Calibri"/>
+          <w:b/>
+          <w:bCs/>
+          <w:sz w:val="21"/>
+          <w:szCs w:val="21"/>
+        </w:rPr>
+        <w:t xml:space="preserve">Vitest: </w:t>
+      </w:r>
+      <w:r>
+        <w:rPr>
+          <w:rFonts w:ascii="Calibri" w:cs="Calibri" w:eastAsia="Calibri" w:hAnsi="Calibri"/>
+          <w:sz w:val="21"/>
+          <w:szCs w:val="21"/>
+        </w:rPr>
+        <w:t xml:space="preserve">68 tests in 6 files, all passed. New in round 3, in frontend/src/api/crossTab.test.ts (describe refresh timeout, Vitest fake timers): aborts a refresh that never answers, keeps the session and releases the lock; lets a tab waiting for the lock continue after the other tab timed out; clears the timer when the refresh answers in time.</w:t>
+      </w:r>
+    </w:p>
+    <w:p>
+      <w:pPr>
+        <w:pStyle w:val="ListParagraph"/>
+        <w:numPr>
+          <w:ilvl w:val="0"/>
+          <w:numId w:val="2"/>
+        </w:numPr>
+        <w:spacing w:after="80"/>
+      </w:pPr>
+      <w:r>
+        <w:rPr>
+          <w:rFonts w:ascii="Calibri" w:cs="Calibri" w:eastAsia="Calibri" w:hAnsi="Calibri"/>
+          <w:b/>
+          <w:bCs/>
+          <w:sz w:val="21"/>
+          <w:szCs w:val="21"/>
+        </w:rPr>
+        <w:t xml:space="preserve">Lint and build: </w:t>
+      </w:r>
+      <w:r>
+        <w:rPr>
+          <w:rFonts w:ascii="Calibri" w:cs="Calibri" w:eastAsia="Calibri" w:hAnsi="Calibri"/>
+          <w:sz w:val="21"/>
+          <w:szCs w:val="21"/>
+        </w:rPr>
+        <w:t xml:space="preserve">npm ci, npm run lint (no errors), npm run build (passes).</w:t>
+      </w:r>
+    </w:p>
+    <w:p>
+      <w:pPr>
+        <w:pStyle w:val="ListParagraph"/>
+        <w:numPr>
+          <w:ilvl w:val="0"/>
+          <w:numId w:val="2"/>
+        </w:numPr>
+        <w:spacing w:after="80"/>
+      </w:pPr>
+      <w:r>
+        <w:rPr>
+          <w:rFonts w:ascii="Calibri" w:cs="Calibri" w:eastAsia="Calibri" w:hAnsi="Calibri"/>
+          <w:b/>
+          <w:bCs/>
+          <w:sz w:val="21"/>
+          <w:szCs w:val="21"/>
+        </w:rPr>
+        <w:t xml:space="preserve">Deliberate regressions: </w:t>
+      </w:r>
+      <w:r>
+        <w:rPr>
+          <w:rFonts w:ascii="Calibri" w:cs="Calibri" w:eastAsia="Calibri" w:hAnsi="Calibri"/>
+          <w:sz w:val="21"/>
+          <w:szCs w:val="21"/>
+        </w:rPr>
+        <w:t xml:space="preserve">Signal not passed to the refresh fetch: 2 tests failed. Timer that never aborts: 2 tests failed. Timer not cleared: 2 tests failed. Each change was reverted.</w:t>
+      </w:r>
+    </w:p>
+    <w:p>
+      <w:pPr>
+        <w:pStyle w:val="ListParagraph"/>
+        <w:numPr>
+          <w:ilvl w:val="0"/>
+          <w:numId w:val="2"/>
+        </w:numPr>
+        <w:spacing w:after="80"/>
+      </w:pPr>
+      <w:r>
+        <w:rPr>
+          <w:rFonts w:ascii="Calibri" w:cs="Calibri" w:eastAsia="Calibri" w:hAnsi="Calibri"/>
+          <w:b/>
+          <w:bCs/>
+          <w:sz w:val="21"/>
+          <w:szCs w:val="21"/>
+        </w:rPr>
+        <w:t xml:space="preserve">Browser checks: </w:t>
+      </w:r>
+      <w:r>
+        <w:rPr>
+          <w:rFonts w:ascii="Calibri" w:cs="Calibri" w:eastAsia="Calibri" w:hAnsi="Calibri"/>
+          <w:sz w:val="21"/>
+          <w:szCs w:val="21"/>
+        </w:rPr>
+        <w:t xml:space="preserve">5 new checks in Chromium with a mock server whose next refresh never answers: tab 1 shows the Retry screen after about 16 seconds and keeps its tokens, tab 2 waiting for the lock continues and stays signed in, Retry restores tab 1, both refresh requests reached the server. The 20 earlier checks still pass.</w:t>
+      </w:r>
+    </w:p>
+    <w:p>
+      <w:pPr>
+        <w:pStyle w:val="Heading2"/>
+        <w:spacing w:after="100" w:before="200"/>
+      </w:pPr>
+      <w:r>
+        <w:rPr>
+          <w:rFonts w:ascii="Calibri" w:cs="Calibri" w:eastAsia="Calibri" w:hAnsi="Calibri"/>
+          <w:b/>
+          <w:bCs/>
+          <w:color w:val="2169BA"/>
+          <w:sz w:val="24"/>
+          <w:szCs w:val="24"/>
+        </w:rPr>
+        <w:t xml:space="preserve">8.4 Remaining risks</w:t>
+      </w:r>
+    </w:p>
+    <w:p>
+      <w:pPr>
+        <w:pStyle w:val="ListParagraph"/>
+        <w:numPr>
+          <w:ilvl w:val="0"/>
+          <w:numId w:val="2"/>
+        </w:numPr>
+        <w:spacing w:after="80"/>
+      </w:pPr>
+      <w:r>
+        <w:rPr>
+          <w:rFonts w:ascii="Calibri" w:cs="Calibri" w:eastAsia="Calibri" w:hAnsi="Calibri"/>
+          <w:sz w:val="21"/>
+          <w:szCs w:val="21"/>
+        </w:rPr>
+        <w:t xml:space="preserve">Not verified against the real backend and SQL Server; the manual cases M01 to M16 are still to be run on a team machine.</w:t>
+      </w:r>
+    </w:p>
+    <w:p>
+      <w:pPr>
+        <w:pStyle w:val="ListParagraph"/>
+        <w:numPr>
+          <w:ilvl w:val="0"/>
+          <w:numId w:val="2"/>
+        </w:numPr>
+        <w:spacing w:after="80"/>
+      </w:pPr>
+      <w:r>
+        <w:rPr>
+          <w:rFonts w:ascii="Calibri" w:cs="Calibri" w:eastAsia="Calibri" w:hAnsi="Calibri"/>
+          <w:sz w:val="21"/>
+          <w:szCs w:val="21"/>
+        </w:rPr>
+        <w:t xml:space="preserve">Not compared with the Figma file itself.</w:t>
+      </w:r>
+    </w:p>
+    <w:p>
+      <w:pPr>
+        <w:pStyle w:val="ListParagraph"/>
+        <w:numPr>
+          <w:ilvl w:val="0"/>
+          <w:numId w:val="2"/>
+        </w:numPr>
+        <w:spacing w:after="80"/>
+      </w:pPr>
+      <w:r>
+        <w:rPr>
+          <w:rFonts w:ascii="Calibri" w:cs="Calibri" w:eastAsia="Calibri" w:hAnsi="Calibri"/>
+          <w:sz w:val="21"/>
+          <w:szCs w:val="21"/>
+        </w:rPr>
+        <w:t xml:space="preserve">Old browsers without the Web Locks API were not tested in a real browser; only the unit test of the fallback covers them.</w:t>
+      </w:r>
+    </w:p>
+    <w:p>
+      <w:pPr>
+        <w:pStyle w:val="ListParagraph"/>
+        <w:numPr>
+          <w:ilvl w:val="0"/>
+          <w:numId w:val="2"/>
+        </w:numPr>
+        <w:spacing w:after="80"/>
+      </w:pPr>
+      <w:r>
+        <w:rPr>
+          <w:rFonts w:ascii="Calibri" w:cs="Calibri" w:eastAsia="Calibri" w:hAnsi="Calibri"/>
+          <w:sz w:val="21"/>
+          <w:szCs w:val="21"/>
+        </w:rPr>
+        <w:t xml:space="preserve">A user on a very slow network whose refresh takes longer than 15 seconds sees the Retry screen instead of waiting longer; Retry tries again.</w:t>
+      </w:r>
+    </w:p>
+    <w:p>
+      <w:pPr>
+        <w:pStyle w:val="ListParagraph"/>
+        <w:numPr>
+          <w:ilvl w:val="0"/>
+          <w:numId w:val="2"/>
+        </w:numPr>
+        <w:spacing w:after="80"/>
+      </w:pPr>
+      <w:r>
+        <w:rPr>
+          <w:rFonts w:ascii="Calibri" w:cs="Calibri" w:eastAsia="Calibri" w:hAnsi="Calibri"/>
+          <w:sz w:val="21"/>
+          <w:szCs w:val="21"/>
+        </w:rPr>
+        <w:t xml:space="preserve">Backend risks R1 and R2 from section 7.2 remain until the backend team decides.</w:t>
+      </w:r>
+    </w:p>
+    <w:p>
+      <w:pPr>
+        <w:pStyle w:val="Heading2"/>
+        <w:spacing w:after="100" w:before="200"/>
+      </w:pPr>
+      <w:r>
+        <w:rPr>
+          <w:rFonts w:ascii="Calibri" w:cs="Calibri" w:eastAsia="Calibri" w:hAnsi="Calibri"/>
+          <w:b/>
+          <w:bCs/>
+          <w:color w:val="2169BA"/>
+          <w:sz w:val="24"/>
+          <w:szCs w:val="24"/>
+        </w:rPr>
+        <w:t xml:space="preserve">8.5 Files changed in review round 3</w:t>
+      </w:r>
+    </w:p>
+    <w:p>
+      <w:pPr>
+        <w:spacing w:after="120" w:before="0"/>
+      </w:pPr>
+      <w:r>
+        <w:rPr>
+          <w:rFonts w:ascii="Calibri" w:cs="Calibri" w:eastAsia="Calibri" w:hAnsi="Calibri"/>
+          <w:sz w:val="21"/>
+          <w:szCs w:val="21"/>
+        </w:rPr>
+        <w:t xml:space="preserve">5 files, all modified. Paths are relative to the repository root.</w:t>
+      </w:r>
+    </w:p>
+    <w:tbl>
+      <w:tblPr>
+        <w:tblW w:type="dxa" w:w="9360"/>
+        <w:tblBorders>
+          <w:top w:val="single" w:color="auto" w:sz="4"/>
+          <w:left w:val="single" w:color="auto" w:sz="4"/>
+          <w:bottom w:val="single" w:color="auto" w:sz="4"/>
+          <w:right w:val="single" w:color="auto" w:sz="4"/>
+          <w:insideH w:val="single" w:color="auto" w:sz="4"/>
+          <w:insideV w:val="single" w:color="auto" w:sz="4"/>
+        </w:tblBorders>
+      </w:tblPr>
+      <w:tblGrid>
+        <w:gridCol w:w="1100"/>
+        <w:gridCol w:w="4060"/>
+        <w:gridCol w:w="4200"/>
+      </w:tblGrid>
+      <w:tr>
+        <w:trPr>
+          <w:cantSplit/>
+          <w:tblHeader/>
+        </w:trPr>
+        <w:tc>
+          <w:tcPr>
+            <w:tcW w:type="dxa" w:w="1100"/>
+            <w:tcBorders>
+              <w:top w:val="single" w:color="C5D3E1" w:sz="4"/>
+              <w:left w:val="single" w:color="C5D3E1" w:sz="4"/>
+              <w:bottom w:val="single" w:color="C5D3E1" w:sz="4"/>
+              <w:right w:val="single" w:color="C5D3E1" w:sz="4"/>
+            </w:tcBorders>
+            <w:shd w:fill="EAF3FD" w:color="auto" w:val="clear"/>
+            <w:tcMar>
+              <w:top w:type="dxa" w:w="60"/>
+              <w:left w:type="dxa" w:w="100"/>
+              <w:bottom w:type="dxa" w:w="60"/>
+              <w:right w:type="dxa" w:w="100"/>
+            </w:tcMar>
+          </w:tcPr>
+          <w:p>
+            <w:r>
+              <w:rPr>
+                <w:rFonts w:ascii="Calibri" w:cs="Calibri" w:eastAsia="Calibri" w:hAnsi="Calibri"/>
+                <w:b/>
+                <w:bCs/>
+                <w:sz w:val="18"/>
+                <w:szCs w:val="18"/>
+              </w:rPr>
+              <w:t xml:space="preserve">Status</w:t>
+            </w:r>
+          </w:p>
+        </w:tc>
+        <w:tc>
+          <w:tcPr>
+            <w:tcW w:type="dxa" w:w="4060"/>
+            <w:tcBorders>
+              <w:top w:val="single" w:color="C5D3E1" w:sz="4"/>
+              <w:left w:val="single" w:color="C5D3E1" w:sz="4"/>
+              <w:bottom w:val="single" w:color="C5D3E1" w:sz="4"/>
+              <w:right w:val="single" w:color="C5D3E1" w:sz="4"/>
+            </w:tcBorders>
+            <w:shd w:fill="EAF3FD" w:color="auto" w:val="clear"/>
+            <w:tcMar>
+              <w:top w:type="dxa" w:w="60"/>
+              <w:left w:type="dxa" w:w="100"/>
+              <w:bottom w:type="dxa" w:w="60"/>
+              <w:right w:type="dxa" w:w="100"/>
+            </w:tcMar>
+          </w:tcPr>
+          <w:p>
+            <w:r>
+              <w:rPr>
+                <w:rFonts w:ascii="Calibri" w:cs="Calibri" w:eastAsia="Calibri" w:hAnsi="Calibri"/>
+                <w:b/>
+                <w:bCs/>
+                <w:sz w:val="18"/>
+                <w:szCs w:val="18"/>
+              </w:rPr>
+              <w:t xml:space="preserve">File Path</w:t>
+            </w:r>
+          </w:p>
+        </w:tc>
+        <w:tc>
+          <w:tcPr>
+            <w:tcW w:type="dxa" w:w="4200"/>
+            <w:tcBorders>
+              <w:top w:val="single" w:color="C5D3E1" w:sz="4"/>
+              <w:left w:val="single" w:color="C5D3E1" w:sz="4"/>
+              <w:bottom w:val="single" w:color="C5D3E1" w:sz="4"/>
+              <w:right w:val="single" w:color="C5D3E1" w:sz="4"/>
+            </w:tcBorders>
+            <w:shd w:fill="EAF3FD" w:color="auto" w:val="clear"/>
+            <w:tcMar>
+              <w:top w:type="dxa" w:w="60"/>
+              <w:left w:type="dxa" w:w="100"/>
+              <w:bottom w:type="dxa" w:w="60"/>
+              <w:right w:type="dxa" w:w="100"/>
+            </w:tcMar>
+          </w:tcPr>
+          <w:p>
+            <w:r>
+              <w:rPr>
+                <w:rFonts w:ascii="Calibri" w:cs="Calibri" w:eastAsia="Calibri" w:hAnsi="Calibri"/>
+                <w:b/>
+                <w:bCs/>
+                <w:sz w:val="18"/>
+                <w:szCs w:val="18"/>
+              </w:rPr>
+              <w:t xml:space="preserve">Change in round 3</w:t>
+            </w:r>
+          </w:p>
+        </w:tc>
+      </w:tr>
+      <w:tr>
+        <w:trPr>
+          <w:cantSplit/>
+          <w:tblHeader w:val="false"/>
+        </w:trPr>
+        <w:tc>
+          <w:tcPr>
+            <w:tcW w:type="dxa" w:w="1100"/>
+            <w:tcBorders>
+              <w:top w:val="single" w:color="C5D3E1" w:sz="4"/>
+              <w:left w:val="single" w:color="C5D3E1" w:sz="4"/>
+              <w:bottom w:val="single" w:color="C5D3E1" w:sz="4"/>
+              <w:right w:val="single" w:color="C5D3E1" w:sz="4"/>
+            </w:tcBorders>
+            <w:tcMar>
+              <w:top w:type="dxa" w:w="60"/>
+              <w:left w:type="dxa" w:w="100"/>
+              <w:bottom w:type="dxa" w:w="60"/>
+              <w:right w:type="dxa" w:w="100"/>
+            </w:tcMar>
+          </w:tcPr>
+          <w:p>
+            <w:r>
+              <w:rPr>
+                <w:rFonts w:ascii="Calibri" w:cs="Calibri" w:eastAsia="Calibri" w:hAnsi="Calibri"/>
+                <w:b w:val="false"/>
+                <w:bCs w:val="false"/>
+                <w:sz w:val="18"/>
+                <w:szCs w:val="18"/>
+              </w:rPr>
+              <w:t xml:space="preserve">Modified</w:t>
+            </w:r>
+          </w:p>
+        </w:tc>
+        <w:tc>
+          <w:tcPr>
+            <w:tcW w:type="dxa" w:w="4060"/>
+            <w:tcBorders>
+              <w:top w:val="single" w:color="C5D3E1" w:sz="4"/>
+              <w:left w:val="single" w:color="C5D3E1" w:sz="4"/>
+              <w:bottom w:val="single" w:color="C5D3E1" w:sz="4"/>
+              <w:right w:val="single" w:color="C5D3E1" w:sz="4"/>
+            </w:tcBorders>
+            <w:tcMar>
+              <w:top w:type="dxa" w:w="60"/>
+              <w:left w:type="dxa" w:w="100"/>
+              <w:bottom w:type="dxa" w:w="60"/>
+              <w:right w:type="dxa" w:w="100"/>
+            </w:tcMar>
+          </w:tcPr>
+          <w:p>
+            <w:r>
+              <w:rPr>
+                <w:rFonts w:ascii="Calibri" w:cs="Calibri" w:eastAsia="Calibri" w:hAnsi="Calibri"/>
+                <w:b w:val="false"/>
+                <w:bCs w:val="false"/>
+                <w:sz w:val="18"/>
+                <w:szCs w:val="18"/>
+              </w:rPr>
+              <w:t xml:space="preserve">CHANGELOG.md</w:t>
+            </w:r>
+          </w:p>
+        </w:tc>
+        <w:tc>
+          <w:tcPr>
+            <w:tcW w:type="dxa" w:w="4200"/>
+            <w:tcBorders>
+              <w:top w:val="single" w:color="C5D3E1" w:sz="4"/>
+              <w:left w:val="single" w:color="C5D3E1" w:sz="4"/>
+              <w:bottom w:val="single" w:color="C5D3E1" w:sz="4"/>
+              <w:right w:val="single" w:color="C5D3E1" w:sz="4"/>
+            </w:tcBorders>
+            <w:tcMar>
+              <w:top w:type="dxa" w:w="60"/>
+              <w:left w:type="dxa" w:w="100"/>
+              <w:bottom w:type="dxa" w:w="60"/>
+              <w:right w:type="dxa" w:w="100"/>
+            </w:tcMar>
+          </w:tcPr>
+          <w:p>
+            <w:r>
+              <w:rPr>
+                <w:rFonts w:ascii="Calibri" w:cs="Calibri" w:eastAsia="Calibri" w:hAnsi="Calibri"/>
+                <w:b w:val="false"/>
+                <w:bCs w:val="false"/>
+                <w:sz w:val="18"/>
+                <w:szCs w:val="18"/>
+              </w:rPr>
+              <w:t xml:space="preserve">FE-00 entry: Review round 3 subsection and totals; BE-09 entry: four arrows in prose replaced with the word gives</w:t>
+            </w:r>
+          </w:p>
+        </w:tc>
+      </w:tr>
+      <w:tr>
+        <w:trPr>
+          <w:cantSplit/>
+          <w:tblHeader w:val="false"/>
+        </w:trPr>
+        <w:tc>
+          <w:tcPr>
+            <w:tcW w:type="dxa" w:w="1100"/>
+            <w:tcBorders>
+              <w:top w:val="single" w:color="C5D3E1" w:sz="4"/>
+              <w:left w:val="single" w:color="C5D3E1" w:sz="4"/>
+              <w:bottom w:val="single" w:color="C5D3E1" w:sz="4"/>
+              <w:right w:val="single" w:color="C5D3E1" w:sz="4"/>
+            </w:tcBorders>
+            <w:tcMar>
+              <w:top w:type="dxa" w:w="60"/>
+              <w:left w:type="dxa" w:w="100"/>
+              <w:bottom w:type="dxa" w:w="60"/>
+              <w:right w:type="dxa" w:w="100"/>
+            </w:tcMar>
+          </w:tcPr>
+          <w:p>
+            <w:r>
+              <w:rPr>
+                <w:rFonts w:ascii="Calibri" w:cs="Calibri" w:eastAsia="Calibri" w:hAnsi="Calibri"/>
+                <w:b w:val="false"/>
+                <w:bCs w:val="false"/>
+                <w:sz w:val="18"/>
+                <w:szCs w:val="18"/>
+              </w:rPr>
+              <w:t xml:space="preserve">Modified</w:t>
+            </w:r>
+          </w:p>
+        </w:tc>
+        <w:tc>
+          <w:tcPr>
+            <w:tcW w:type="dxa" w:w="4060"/>
+            <w:tcBorders>
+              <w:top w:val="single" w:color="C5D3E1" w:sz="4"/>
+              <w:left w:val="single" w:color="C5D3E1" w:sz="4"/>
+              <w:bottom w:val="single" w:color="C5D3E1" w:sz="4"/>
+              <w:right w:val="single" w:color="C5D3E1" w:sz="4"/>
+            </w:tcBorders>
+            <w:tcMar>
+              <w:top w:type="dxa" w:w="60"/>
+              <w:left w:type="dxa" w:w="100"/>
+              <w:bottom w:type="dxa" w:w="60"/>
+              <w:right w:type="dxa" w:w="100"/>
+            </w:tcMar>
+          </w:tcPr>
+          <w:p>
+            <w:r>
+              <w:rPr>
+                <w:rFonts w:ascii="Calibri" w:cs="Calibri" w:eastAsia="Calibri" w:hAnsi="Calibri"/>
+                <w:b w:val="false"/>
+                <w:bCs w:val="false"/>
+                <w:sz w:val="18"/>
+                <w:szCs w:val="18"/>
+              </w:rPr>
+              <w:t xml:space="preserve">docs/audit/FE-00_AI_Audit_Log.docx</w:t>
+            </w:r>
+          </w:p>
+        </w:tc>
+        <w:tc>
+          <w:tcPr>
+            <w:tcW w:type="dxa" w:w="4200"/>
+            <w:tcBorders>
+              <w:top w:val="single" w:color="C5D3E1" w:sz="4"/>
+              <w:left w:val="single" w:color="C5D3E1" w:sz="4"/>
+              <w:bottom w:val="single" w:color="C5D3E1" w:sz="4"/>
+              <w:right w:val="single" w:color="C5D3E1" w:sz="4"/>
+            </w:tcBorders>
+            <w:tcMar>
+              <w:top w:type="dxa" w:w="60"/>
+              <w:left w:type="dxa" w:w="100"/>
+              <w:bottom w:type="dxa" w:w="60"/>
+              <w:right w:type="dxa" w:w="100"/>
+            </w:tcMar>
+          </w:tcPr>
+          <w:p>
+            <w:r>
+              <w:rPr>
+                <w:rFonts w:ascii="Calibri" w:cs="Calibri" w:eastAsia="Calibri" w:hAnsi="Calibri"/>
+                <w:b w:val="false"/>
+                <w:bCs w:val="false"/>
+                <w:sz w:val="18"/>
+                <w:szCs w:val="18"/>
+              </w:rPr>
+              <w:t xml:space="preserve">Review Round 3 section; Step 4b row in words; plain hyphen bullets</w:t>
+            </w:r>
+          </w:p>
+        </w:tc>
+      </w:tr>
+      <w:tr>
+        <w:trPr>
+          <w:cantSplit/>
+          <w:tblHeader w:val="false"/>
+        </w:trPr>
+        <w:tc>
+          <w:tcPr>
+            <w:tcW w:type="dxa" w:w="1100"/>
+            <w:tcBorders>
+              <w:top w:val="single" w:color="C5D3E1" w:sz="4"/>
+              <w:left w:val="single" w:color="C5D3E1" w:sz="4"/>
+              <w:bottom w:val="single" w:color="C5D3E1" w:sz="4"/>
+              <w:right w:val="single" w:color="C5D3E1" w:sz="4"/>
+            </w:tcBorders>
+            <w:tcMar>
+              <w:top w:type="dxa" w:w="60"/>
+              <w:left w:type="dxa" w:w="100"/>
+              <w:bottom w:type="dxa" w:w="60"/>
+              <w:right w:type="dxa" w:w="100"/>
+            </w:tcMar>
+          </w:tcPr>
+          <w:p>
+            <w:r>
+              <w:rPr>
+                <w:rFonts w:ascii="Calibri" w:cs="Calibri" w:eastAsia="Calibri" w:hAnsi="Calibri"/>
+                <w:b w:val="false"/>
+                <w:bCs w:val="false"/>
+                <w:sz w:val="18"/>
+                <w:szCs w:val="18"/>
+              </w:rPr>
+              <w:t xml:space="preserve">Modified</w:t>
+            </w:r>
+          </w:p>
+        </w:tc>
+        <w:tc>
+          <w:tcPr>
+            <w:tcW w:type="dxa" w:w="4060"/>
+            <w:tcBorders>
+              <w:top w:val="single" w:color="C5D3E1" w:sz="4"/>
+              <w:left w:val="single" w:color="C5D3E1" w:sz="4"/>
+              <w:bottom w:val="single" w:color="C5D3E1" w:sz="4"/>
+              <w:right w:val="single" w:color="C5D3E1" w:sz="4"/>
+            </w:tcBorders>
+            <w:tcMar>
+              <w:top w:type="dxa" w:w="60"/>
+              <w:left w:type="dxa" w:w="100"/>
+              <w:bottom w:type="dxa" w:w="60"/>
+              <w:right w:type="dxa" w:w="100"/>
+            </w:tcMar>
+          </w:tcPr>
+          <w:p>
+            <w:r>
+              <w:rPr>
+                <w:rFonts w:ascii="Calibri" w:cs="Calibri" w:eastAsia="Calibri" w:hAnsi="Calibri"/>
+                <w:b w:val="false"/>
+                <w:bCs w:val="false"/>
+                <w:sz w:val="18"/>
+                <w:szCs w:val="18"/>
+              </w:rPr>
+              <w:t xml:space="preserve">docs/tests/FE-00_test_cases.md</w:t>
+            </w:r>
+          </w:p>
+        </w:tc>
+        <w:tc>
+          <w:tcPr>
+            <w:tcW w:type="dxa" w:w="4200"/>
+            <w:tcBorders>
+              <w:top w:val="single" w:color="C5D3E1" w:sz="4"/>
+              <w:left w:val="single" w:color="C5D3E1" w:sz="4"/>
+              <w:bottom w:val="single" w:color="C5D3E1" w:sz="4"/>
+              <w:right w:val="single" w:color="C5D3E1" w:sz="4"/>
+            </w:tcBorders>
+            <w:tcMar>
+              <w:top w:type="dxa" w:w="60"/>
+              <w:left w:type="dxa" w:w="100"/>
+              <w:bottom w:type="dxa" w:w="60"/>
+              <w:right w:type="dxa" w:w="100"/>
+            </w:tcMar>
+          </w:tcPr>
+          <w:p>
+            <w:r>
+              <w:rPr>
+                <w:rFonts w:ascii="Calibri" w:cs="Calibri" w:eastAsia="Calibri" w:hAnsi="Calibri"/>
+                <w:b w:val="false"/>
+                <w:bCs w:val="false"/>
+                <w:sz w:val="18"/>
+                <w:szCs w:val="18"/>
+              </w:rPr>
+              <w:t xml:space="preserve">TC-FE00-068 to TC-FE00-070, 5 browser checks, updated totals</w:t>
+            </w:r>
+          </w:p>
+        </w:tc>
+      </w:tr>
+      <w:tr>
+        <w:trPr>
+          <w:cantSplit/>
+          <w:tblHeader w:val="false"/>
+        </w:trPr>
+        <w:tc>
+          <w:tcPr>
+            <w:tcW w:type="dxa" w:w="1100"/>
+            <w:tcBorders>
+              <w:top w:val="single" w:color="C5D3E1" w:sz="4"/>
+              <w:left w:val="single" w:color="C5D3E1" w:sz="4"/>
+              <w:bottom w:val="single" w:color="C5D3E1" w:sz="4"/>
+              <w:right w:val="single" w:color="C5D3E1" w:sz="4"/>
+            </w:tcBorders>
+            <w:tcMar>
+              <w:top w:type="dxa" w:w="60"/>
+              <w:left w:type="dxa" w:w="100"/>
+              <w:bottom w:type="dxa" w:w="60"/>
+              <w:right w:type="dxa" w:w="100"/>
+            </w:tcMar>
+          </w:tcPr>
+          <w:p>
+            <w:r>
+              <w:rPr>
+                <w:rFonts w:ascii="Calibri" w:cs="Calibri" w:eastAsia="Calibri" w:hAnsi="Calibri"/>
+                <w:b w:val="false"/>
+                <w:bCs w:val="false"/>
+                <w:sz w:val="18"/>
+                <w:szCs w:val="18"/>
+              </w:rPr>
+              <w:t xml:space="preserve">Modified</w:t>
+            </w:r>
+          </w:p>
+        </w:tc>
+        <w:tc>
+          <w:tcPr>
+            <w:tcW w:type="dxa" w:w="4060"/>
+            <w:tcBorders>
+              <w:top w:val="single" w:color="C5D3E1" w:sz="4"/>
+              <w:left w:val="single" w:color="C5D3E1" w:sz="4"/>
+              <w:bottom w:val="single" w:color="C5D3E1" w:sz="4"/>
+              <w:right w:val="single" w:color="C5D3E1" w:sz="4"/>
+            </w:tcBorders>
+            <w:tcMar>
+              <w:top w:type="dxa" w:w="60"/>
+              <w:left w:type="dxa" w:w="100"/>
+              <w:bottom w:type="dxa" w:w="60"/>
+              <w:right w:type="dxa" w:w="100"/>
+            </w:tcMar>
+          </w:tcPr>
+          <w:p>
+            <w:r>
+              <w:rPr>
+                <w:rFonts w:ascii="Calibri" w:cs="Calibri" w:eastAsia="Calibri" w:hAnsi="Calibri"/>
+                <w:b w:val="false"/>
+                <w:bCs w:val="false"/>
+                <w:sz w:val="18"/>
+                <w:szCs w:val="18"/>
+              </w:rPr>
+              <w:t xml:space="preserve">frontend/src/api/client.ts</w:t>
+            </w:r>
+          </w:p>
+        </w:tc>
+        <w:tc>
+          <w:tcPr>
+            <w:tcW w:type="dxa" w:w="4200"/>
+            <w:tcBorders>
+              <w:top w:val="single" w:color="C5D3E1" w:sz="4"/>
+              <w:left w:val="single" w:color="C5D3E1" w:sz="4"/>
+              <w:bottom w:val="single" w:color="C5D3E1" w:sz="4"/>
+              <w:right w:val="single" w:color="C5D3E1" w:sz="4"/>
+            </w:tcBorders>
+            <w:tcMar>
+              <w:top w:type="dxa" w:w="60"/>
+              <w:left w:type="dxa" w:w="100"/>
+              <w:bottom w:type="dxa" w:w="60"/>
+              <w:right w:type="dxa" w:w="100"/>
+            </w:tcMar>
+          </w:tcPr>
+          <w:p>
+            <w:r>
+              <w:rPr>
+                <w:rFonts w:ascii="Calibri" w:cs="Calibri" w:eastAsia="Calibri" w:hAnsi="Calibri"/>
+                <w:b w:val="false"/>
+                <w:bCs w:val="false"/>
+                <w:sz w:val="18"/>
+                <w:szCs w:val="18"/>
+              </w:rPr>
+              <w:t xml:space="preserve">REFRESH_TIMEOUT_MS (15000 ms) on POST /auth/refresh with AbortController and setTimeout; timer cleared in finally</w:t>
+            </w:r>
+          </w:p>
+        </w:tc>
+      </w:tr>
+      <w:tr>
+        <w:trPr>
+          <w:cantSplit/>
+          <w:tblHeader w:val="false"/>
+        </w:trPr>
+        <w:tc>
+          <w:tcPr>
+            <w:tcW w:type="dxa" w:w="1100"/>
+            <w:tcBorders>
+              <w:top w:val="single" w:color="C5D3E1" w:sz="4"/>
+              <w:left w:val="single" w:color="C5D3E1" w:sz="4"/>
+              <w:bottom w:val="single" w:color="C5D3E1" w:sz="4"/>
+              <w:right w:val="single" w:color="C5D3E1" w:sz="4"/>
+            </w:tcBorders>
+            <w:tcMar>
+              <w:top w:type="dxa" w:w="60"/>
+              <w:left w:type="dxa" w:w="100"/>
+              <w:bottom w:type="dxa" w:w="60"/>
+              <w:right w:type="dxa" w:w="100"/>
+            </w:tcMar>
+          </w:tcPr>
+          <w:p>
+            <w:r>
+              <w:rPr>
+                <w:rFonts w:ascii="Calibri" w:cs="Calibri" w:eastAsia="Calibri" w:hAnsi="Calibri"/>
+                <w:b w:val="false"/>
+                <w:bCs w:val="false"/>
+                <w:sz w:val="18"/>
+                <w:szCs w:val="18"/>
+              </w:rPr>
+              <w:t xml:space="preserve">Modified</w:t>
+            </w:r>
+          </w:p>
+        </w:tc>
+        <w:tc>
+          <w:tcPr>
+            <w:tcW w:type="dxa" w:w="4060"/>
+            <w:tcBorders>
+              <w:top w:val="single" w:color="C5D3E1" w:sz="4"/>
+              <w:left w:val="single" w:color="C5D3E1" w:sz="4"/>
+              <w:bottom w:val="single" w:color="C5D3E1" w:sz="4"/>
+              <w:right w:val="single" w:color="C5D3E1" w:sz="4"/>
+            </w:tcBorders>
+            <w:tcMar>
+              <w:top w:type="dxa" w:w="60"/>
+              <w:left w:type="dxa" w:w="100"/>
+              <w:bottom w:type="dxa" w:w="60"/>
+              <w:right w:type="dxa" w:w="100"/>
+            </w:tcMar>
+          </w:tcPr>
+          <w:p>
+            <w:r>
+              <w:rPr>
+                <w:rFonts w:ascii="Calibri" w:cs="Calibri" w:eastAsia="Calibri" w:hAnsi="Calibri"/>
+                <w:b w:val="false"/>
+                <w:bCs w:val="false"/>
+                <w:sz w:val="18"/>
+                <w:szCs w:val="18"/>
+              </w:rPr>
+              <w:t xml:space="preserve">frontend/src/api/crossTab.test.ts</w:t>
+            </w:r>
+          </w:p>
+        </w:tc>
+        <w:tc>
+          <w:tcPr>
+            <w:tcW w:type="dxa" w:w="4200"/>
+            <w:tcBorders>
+              <w:top w:val="single" w:color="C5D3E1" w:sz="4"/>
+              <w:left w:val="single" w:color="C5D3E1" w:sz="4"/>
+              <w:bottom w:val="single" w:color="C5D3E1" w:sz="4"/>
+              <w:right w:val="single" w:color="C5D3E1" w:sz="4"/>
+            </w:tcBorders>
+            <w:tcMar>
+              <w:top w:type="dxa" w:w="60"/>
+              <w:left w:type="dxa" w:w="100"/>
+              <w:bottom w:type="dxa" w:w="60"/>
+              <w:right w:type="dxa" w:w="100"/>
+            </w:tcMar>
+          </w:tcPr>
+          <w:p>
+            <w:r>
+              <w:rPr>
+                <w:rFonts w:ascii="Calibri" w:cs="Calibri" w:eastAsia="Calibri" w:hAnsi="Calibri"/>
+                <w:b w:val="false"/>
+                <w:bCs w:val="false"/>
+                <w:sz w:val="18"/>
+                <w:szCs w:val="18"/>
+              </w:rPr>
+              <w:t xml:space="preserve">3 fake timer tests in describe refresh timeout</w:t>
+            </w:r>
+          </w:p>
+        </w:tc>
+      </w:tr>
+    </w:tbl>
+    <w:p>
+      <w:pPr>
+        <w:pStyle w:val="Heading1"/>
+        <w:spacing w:after="120" w:before="280"/>
+      </w:pPr>
+      <w:r>
+        <w:rPr>
+          <w:rFonts w:ascii="Calibri" w:cs="Calibri" w:eastAsia="Calibri" w:hAnsi="Calibri"/>
+          <w:b/>
+          <w:bCs/>
+          <w:color w:val="102E50"/>
+          <w:sz w:val="28"/>
+          <w:szCs w:val="28"/>
+        </w:rPr>
+        <w:t xml:space="preserve">9. Repository File Inventory (whole task, compared with main)</w:t>
       </w:r>
     </w:p>
     <w:p>
@@ -15178,7 +16670,7 @@
           <w:sz w:val="28"/>
           <w:szCs w:val="28"/>
         </w:rPr>
-        <w:t xml:space="preserve">9. Pre-Merge Verification Guidance</w:t>
+        <w:t xml:space="preserve">10. Pre-Merge Verification Guidance</w:t>
       </w:r>
     </w:p>
     <w:p>
@@ -15409,7 +16901,7 @@
     <w:lvl w:ilvl="0" w15:tentative="1">
       <w:start w:val="1"/>
       <w:numFmt w:val="bullet"/>
-      <w:lvlText w:val="●"/>
+      <w:lvlText w:val="-"/>
       <w:lvlJc w:val="left"/>
       <w:pPr>
         <w:ind w:left="720" w:hanging="360"/>
@@ -15418,7 +16910,7 @@
     <w:lvl w:ilvl="1" w15:tentative="1">
       <w:start w:val="1"/>
       <w:numFmt w:val="bullet"/>
-      <w:lvlText w:val="○"/>
+      <w:lvlText w:val="-"/>
       <w:lvlJc w:val="left"/>
       <w:pPr>
         <w:ind w:left="1440" w:hanging="360"/>
@@ -15427,7 +16919,7 @@
     <w:lvl w:ilvl="2" w15:tentative="1">
       <w:start w:val="1"/>
       <w:numFmt w:val="bullet"/>
-      <w:lvlText w:val="■"/>
+      <w:lvlText w:val="-"/>
       <w:lvlJc w:val="left"/>
       <w:pPr>
         <w:ind w:left="2160" w:hanging="360"/>
@@ -15436,7 +16928,7 @@
     <w:lvl w:ilvl="3" w15:tentative="1">
       <w:start w:val="1"/>
       <w:numFmt w:val="bullet"/>
-      <w:lvlText w:val="●"/>
+      <w:lvlText w:val="-"/>
       <w:lvlJc w:val="left"/>
       <w:pPr>
         <w:ind w:left="2880" w:hanging="360"/>
@@ -15445,7 +16937,7 @@
     <w:lvl w:ilvl="4" w15:tentative="1">
       <w:start w:val="1"/>
       <w:numFmt w:val="bullet"/>
-      <w:lvlText w:val="○"/>
+      <w:lvlText w:val="-"/>
       <w:lvlJc w:val="left"/>
       <w:pPr>
         <w:ind w:left="3600" w:hanging="360"/>
@@ -15454,7 +16946,7 @@
     <w:lvl w:ilvl="5" w15:tentative="1">
       <w:start w:val="1"/>
       <w:numFmt w:val="bullet"/>
-      <w:lvlText w:val="■"/>
+      <w:lvlText w:val="-"/>
       <w:lvlJc w:val="left"/>
       <w:pPr>
         <w:ind w:left="4320" w:hanging="360"/>
@@ -15463,7 +16955,7 @@
     <w:lvl w:ilvl="6" w15:tentative="1">
       <w:start w:val="1"/>
       <w:numFmt w:val="bullet"/>
-      <w:lvlText w:val="●"/>
+      <w:lvlText w:val="-"/>
       <w:lvlJc w:val="left"/>
       <w:pPr>
         <w:ind w:left="5040" w:hanging="360"/>
@@ -15472,7 +16964,7 @@
     <w:lvl w:ilvl="7" w15:tentative="1">
       <w:start w:val="1"/>
       <w:numFmt w:val="bullet"/>
-      <w:lvlText w:val="●"/>
+      <w:lvlText w:val="-"/>
       <w:lvlJc w:val="left"/>
       <w:pPr>
         <w:ind w:left="5760" w:hanging="360"/>
@@ -15481,7 +16973,7 @@
     <w:lvl w:ilvl="8" w15:tentative="1">
       <w:start w:val="1"/>
       <w:numFmt w:val="bullet"/>
-      <w:lvlText w:val="●"/>
+      <w:lvlText w:val="-"/>
       <w:lvlJc w:val="left"/>
       <w:pPr>
         <w:ind w:left="6480" w:hanging="360"/>
@@ -15493,7 +16985,7 @@
     <w:lvl w:ilvl="0" w15:tentative="1">
       <w:start w:val="1"/>
       <w:numFmt w:val="bullet"/>
-      <w:lvlText w:val="•"/>
+      <w:lvlText w:val="-"/>
       <w:lvlJc w:val="left"/>
       <w:pPr>
         <w:ind w:left="540" w:hanging="270"/>

</xml_diff>